<commit_message>
feat(research): publish E15 confirmation and portable PI studies
</commit_message>
<xml_diff>
--- a/docs/papers/thesis/thesis_draft_zh.docx
+++ b/docs/papers/thesis/thesis_draft_zh.docx
@@ -24318,7 +24318,7 @@
         <w:rPr>
           <w:b/>
         </w:rPr>
-        <w:t xml:space="preserve">5.9.3.7 BMC 跨 run 資料修正與回溯敏感度</w:t>
+        <w:t xml:space="preserve">5.9.3.7 BMC 跨 run 資料修正、回溯敏感度與同伺服器確認</w:t>
       </w:r>
     </w:p>
     <w:p>
@@ -24570,7 +24570,251 @@
         <w:spacing w:before="0" w:after="0" w:line="360" w:lineRule="auto"/>
       </w:pPr>
       <w:r>
-        <w:t xml:space="preserve">E14C 在 E14B 修正資料上重跑未改動的 candidate family。Load-aware ridge 的 macro MAE 改善之 run-block bootstrap 95% 區間為 [1.4271, 2.7939] °C，且預測落在 37.0033–64.3640 °C，因此通過候選資格閘門。然而這 14 個 test files 已在 E13 與 parser 除錯期間開啟，E14C 只能稱 retrospective sensitivity，不能稱 unseen confirmation。E15 已固定另 14 個未使用檔案、模型內容 hash 與全部閘門，但目前未下載、未執行，狀態維持 NOT_EVALUATED。</w:t>
+        <w:t xml:space="preserve">E14C 在 E14B 修正資料上重跑未改動的 candidate family。Load-aware ridge 的 macro MAE 改善之 run-block bootstrap 95% 區間為 [1.4271, 2.7939] °C，且預測落在 37.0033–64.3640 °C，因此通過候選資格閘門。然而這 14 個 test files 已在 E13 與 parser 除錯期間開啟，E14C 只能稱 retrospective sensitivity，不能稱 unseen confirmation。</w:t>
+      </w:r>
+    </w:p>
+    <w:p>
+      <w:pPr>
+        <w:spacing w:before="0" w:after="0" w:line="360" w:lineRule="auto"/>
+      </w:pPr>
+      <w:r>
+        <w:t xml:space="preserve">E15 在檔案、模型內容 hash 與十項閘門預先固定後，對另 14 個先前未開啟檔案完成一次不重訓確認，共保留 3,112 rows。</w:t>
+      </w:r>
+    </w:p>
+    <w:tbl>
+      <w:tblPr>
+        <w:tblBorders>
+          <w:top w:val="single" w:sz="6" w:space="0" w:color="999999"/>
+          <w:left w:val="single" w:sz="6" w:space="0" w:color="999999"/>
+          <w:bottom w:val="single" w:sz="6" w:space="0" w:color="999999"/>
+          <w:right w:val="single" w:sz="6" w:space="0" w:color="999999"/>
+          <w:insideH w:val="single" w:sz="6" w:space="0" w:color="999999"/>
+          <w:insideV w:val="single" w:sz="6" w:space="0" w:color="999999"/>
+        </w:tblBorders>
+      </w:tblPr>
+      <w:tr>
+        <w:tc>
+          <w:tcPr>
+            <w:tcW w:w="2200" w:type="dxa"/>
+          </w:tcPr>
+          <w:p>
+            <w:pPr>
+              <w:spacing w:before="0" w:after="0" w:line="360" w:lineRule="auto"/>
+            </w:pPr>
+            <w:r>
+              <w:rPr>
+                <w:b/>
+              </w:rPr>
+              <w:t xml:space="preserve">E15 同伺服器 temporal/workload confirmation</w:t>
+            </w:r>
+          </w:p>
+        </w:tc>
+        <w:tc>
+          <w:tcPr>
+            <w:tcW w:w="2200" w:type="dxa"/>
+          </w:tcPr>
+          <w:p>
+            <w:pPr>
+              <w:spacing w:before="0" w:after="0" w:line="360" w:lineRule="auto"/>
+            </w:pPr>
+            <w:r>
+              <w:rPr>
+                <w:b/>
+              </w:rPr>
+              <w:t xml:space="preserve">MAE（°C）</w:t>
+            </w:r>
+          </w:p>
+        </w:tc>
+        <w:tc>
+          <w:tcPr>
+            <w:tcW w:w="2200" w:type="dxa"/>
+          </w:tcPr>
+          <w:p>
+            <w:pPr>
+              <w:spacing w:before="0" w:after="0" w:line="360" w:lineRule="auto"/>
+            </w:pPr>
+            <w:r>
+              <w:rPr>
+                <w:b/>
+              </w:rPr>
+              <w:t xml:space="preserve">RMSE（°C）</w:t>
+            </w:r>
+          </w:p>
+        </w:tc>
+        <w:tc>
+          <w:tcPr>
+            <w:tcW w:w="2200" w:type="dxa"/>
+          </w:tcPr>
+          <w:p>
+            <w:pPr>
+              <w:spacing w:before="0" w:after="0" w:line="360" w:lineRule="auto"/>
+            </w:pPr>
+            <w:r>
+              <w:rPr>
+                <w:b/>
+              </w:rPr>
+              <w:t xml:space="preserve">P95（°C）</w:t>
+            </w:r>
+          </w:p>
+        </w:tc>
+        <w:tc>
+          <w:tcPr>
+            <w:tcW w:w="2200" w:type="dxa"/>
+          </w:tcPr>
+          <w:p>
+            <w:pPr>
+              <w:spacing w:before="0" w:after="0" w:line="360" w:lineRule="auto"/>
+            </w:pPr>
+            <w:r>
+              <w:rPr>
+                <w:b/>
+              </w:rPr>
+              <w:t xml:space="preserve">逐 run 勝出</w:t>
+            </w:r>
+          </w:p>
+        </w:tc>
+      </w:tr>
+      <w:tr>
+        <w:tc>
+          <w:tcPr>
+            <w:tcW w:w="2200" w:type="dxa"/>
+          </w:tcPr>
+          <w:p>
+            <w:pPr>
+              <w:spacing w:before="0" w:after="0" w:line="360" w:lineRule="auto"/>
+            </w:pPr>
+            <w:r>
+              <w:t xml:space="preserve">Inlet + frozen offset baseline</w:t>
+            </w:r>
+          </w:p>
+        </w:tc>
+        <w:tc>
+          <w:tcPr>
+            <w:tcW w:w="2200" w:type="dxa"/>
+          </w:tcPr>
+          <w:p>
+            <w:pPr>
+              <w:spacing w:before="0" w:after="0" w:line="360" w:lineRule="auto"/>
+            </w:pPr>
+            <w:r>
+              <w:t xml:space="preserve">1.6939</w:t>
+            </w:r>
+          </w:p>
+        </w:tc>
+        <w:tc>
+          <w:tcPr>
+            <w:tcW w:w="2200" w:type="dxa"/>
+          </w:tcPr>
+          <w:p>
+            <w:pPr>
+              <w:spacing w:before="0" w:after="0" w:line="360" w:lineRule="auto"/>
+            </w:pPr>
+            <w:r>
+              <w:t xml:space="preserve">1.9672</w:t>
+            </w:r>
+          </w:p>
+        </w:tc>
+        <w:tc>
+          <w:tcPr>
+            <w:tcW w:w="2200" w:type="dxa"/>
+          </w:tcPr>
+          <w:p>
+            <w:pPr>
+              <w:spacing w:before="0" w:after="0" w:line="360" w:lineRule="auto"/>
+            </w:pPr>
+            <w:r>
+              <w:t xml:space="preserve">3.5000</w:t>
+            </w:r>
+          </w:p>
+        </w:tc>
+        <w:tc>
+          <w:tcPr>
+            <w:tcW w:w="2200" w:type="dxa"/>
+          </w:tcPr>
+          <w:p>
+            <w:pPr>
+              <w:spacing w:before="0" w:after="0" w:line="360" w:lineRule="auto"/>
+            </w:pPr>
+            <w:r>
+              <w:t xml:space="preserve">2/14</w:t>
+            </w:r>
+          </w:p>
+        </w:tc>
+      </w:tr>
+      <w:tr>
+        <w:tc>
+          <w:tcPr>
+            <w:tcW w:w="2200" w:type="dxa"/>
+          </w:tcPr>
+          <w:p>
+            <w:pPr>
+              <w:spacing w:before="0" w:after="0" w:line="360" w:lineRule="auto"/>
+            </w:pPr>
+            <w:r>
+              <w:t xml:space="preserve">Frozen load-aware ridge</w:t>
+            </w:r>
+          </w:p>
+        </w:tc>
+        <w:tc>
+          <w:tcPr>
+            <w:tcW w:w="2200" w:type="dxa"/>
+          </w:tcPr>
+          <w:p>
+            <w:pPr>
+              <w:spacing w:before="0" w:after="0" w:line="360" w:lineRule="auto"/>
+            </w:pPr>
+            <w:r>
+              <w:t xml:space="preserve">0.9744</w:t>
+            </w:r>
+          </w:p>
+        </w:tc>
+        <w:tc>
+          <w:tcPr>
+            <w:tcW w:w="2200" w:type="dxa"/>
+          </w:tcPr>
+          <w:p>
+            <w:pPr>
+              <w:spacing w:before="0" w:after="0" w:line="360" w:lineRule="auto"/>
+            </w:pPr>
+            <w:r>
+              <w:t xml:space="preserve">1.2056</w:t>
+            </w:r>
+          </w:p>
+        </w:tc>
+        <w:tc>
+          <w:tcPr>
+            <w:tcW w:w="2200" w:type="dxa"/>
+          </w:tcPr>
+          <w:p>
+            <w:pPr>
+              <w:spacing w:before="0" w:after="0" w:line="360" w:lineRule="auto"/>
+            </w:pPr>
+            <w:r>
+              <w:t xml:space="preserve">2.3888</w:t>
+            </w:r>
+          </w:p>
+        </w:tc>
+        <w:tc>
+          <w:tcPr>
+            <w:tcW w:w="2200" w:type="dxa"/>
+          </w:tcPr>
+          <w:p>
+            <w:pPr>
+              <w:spacing w:before="0" w:after="0" w:line="360" w:lineRule="auto"/>
+            </w:pPr>
+            <w:r>
+              <w:t xml:space="preserve">12/14</w:t>
+            </w:r>
+          </w:p>
+        </w:tc>
+      </w:tr>
+    </w:tbl>
+    <w:p>
+      <w:pPr>
+        <w:spacing w:before="0" w:after="0" w:line="360" w:lineRule="auto"/>
+      </w:pPr>
+      <w:r>
+        <w:t xml:space="preserve">E15 的 macro run MAE 改善為 0.6134 °C，20,000 次 run-block bootstrap 95% 區間為 [0.2721, 0.9831] °C；十項閘門全數通過，因此 H-ENC-08 判定支持。仍保留 202308051757.csv 與 202310252230.csv 的負向結果，MAE 改善分別為 -0.5537 與 -0.3011 °C。此確認僅支持同一伺服器的 temporal/workload transfer，不驗證個人電腦機箱、NTC 硬體、跨伺服器轉移、3-D 空間熱場或控制效益；機箱是目前應用推進方向，單房間研究仍保留為論文整體範圍。</w:t>
       </w:r>
     </w:p>
     <w:p>
@@ -25231,7 +25475,7 @@
         <w:spacing w:before="0" w:after="0" w:line="360" w:lineRule="auto"/>
       </w:pPr>
       <w:r>
-        <w:t xml:space="preserve">BMC E12–E14C 的主要研究成果是把資料可用性、parser 正確性、單位正規化與模型表現拆開驗證。E12 在 final-test 未開啟前因六個 development files 未達 30 rows 而停止；E13 的輸出因舊 parser／unit pipeline 而失效。E14A/E14B 完成 4,038 rows 的來源與單位稽核後，E14C 的 frozen load-aware ridge 將回溯 test MAE 由 4.0882°C 降至 1.8054°C、勝出 13/14 runs，bootstrap 區間為 [1.4271, 2.7939]°C。此結果只使候選具備進入新確認的資格；E15 尚未執行，不能宣稱跨時間確認完成。</w:t>
+        <w:t xml:space="preserve">BMC E12–E15 的主要研究成果是把資料可用性、parser 正確性、單位正規化與模型表現拆開驗證。E12 在 final-test 未開啟前因六個 development files 未達 30 rows 而停止；E13 的輸出因舊 parser／unit pipeline 而失效。E14A/E14B 完成 4,038 rows 的來源與單位稽核後，E14C 的 frozen load-aware ridge 將回溯 test MAE 由 4.0882°C 降至 1.8054°C、勝出 13/14 runs，bootstrap 區間為 [1.4271, 2.7939]°C。E15 再以另 14 個先前未開啟檔案、3,112 rows 完成不重訓確認，MAE 由 1.6939°C 降至 0.9744°C、勝出 12/14 runs，macro run MAE 改善區間為 [0.2721, 0.9831]°C，十項閘門全通過。H-ENC-08 的支持僅限同伺服器 temporal/workload transfer，仍有兩個 runs 退步。</w:t>
       </w:r>
     </w:p>
     <w:p>
@@ -25411,7 +25655,7 @@
         <w:spacing w:before="0" w:after="0" w:line="360" w:lineRule="auto"/>
       </w:pPr>
       <w:r>
-        <w:t xml:space="preserve">• BMC E12 因 6 個 development files 未達 30-row 門檻而未評估 final test；E13 為 parser-invalidated。E14C 雖在修正後回溯資料上顯著優於 baseline，但 test bytes 已開啟，只能視為候選資格證據；E15 仍為 NOT_EVALUATED。</w:t>
+        <w:t xml:space="preserve">• BMC E12 因 6 個 development files 未達 30-row 門檻而未評估 final test；E13 為 parser-invalidated。E14C 仍只構成回溯候選資格證據；E15 雖通過十項閘門、12/14 runs 勝出，但只支持同伺服器 temporal/workload transfer，且兩個退步 runs 必須保留。</w:t>
       </w:r>
     </w:p>
     <w:p>
@@ -25576,7 +25820,7 @@
         <w:spacing w:before="0" w:after="0" w:line="360" w:lineRule="auto"/>
       </w:pPr>
       <w:r>
-        <w:t xml:space="preserve">• 機箱 E11A 至 E11F 已完成分層研究；E11D 支持角色語意的預測資訊，E11F 只支持同一 AAU campaign 的 commissioning-assisted unseen-byte transfer。BMC E14C 候選仍須由尚未執行的 E15 新檔案確認。後續任何跨機箱、跨伺服器、NTC 硬體或氣流因果主張都必須另立 protocol。</w:t>
+        <w:t xml:space="preserve">• 機箱 E11A 至 E11F 已完成分層研究；E11D 支持角色語意的預測資訊，E11F 只支持同一 AAU campaign 的 commissioning-assisted unseen-byte transfer。BMC E15 已完成同伺服器 temporal/workload confirmation；後續個人電腦機箱實測、跨機箱、跨伺服器、NTC 硬體或氣流因果主張都必須另立 protocol。</w:t>
       </w:r>
     </w:p>
     <w:p>

</xml_diff>

<commit_message>
research: synchronize enclosure evidence and LQR briefing artifacts
</commit_message>
<xml_diff>
--- a/docs/papers/thesis/thesis_draft_zh.docx
+++ b/docs/papers/thesis/thesis_draft_zh.docx
@@ -25811,7 +25811,7 @@
         <w:spacing w:before="0" w:after="0" w:line="360" w:lineRule="auto"/>
       </w:pPr>
       <w:r>
-        <w:t xml:space="preserve">• 將 PID 納入未來閉環控制 baseline；在執行前固定 plant、動態 setpoint、disturbance、sampling、actuator limit 與安全 cutoff，並比較 tracking MAE、settling time、overshoot、control effort 與 constraint violations。PID 不屬於 3-D 場估測器，目前亦為 NOT_EVALUATED。</w:t>
+        <w:t xml:space="preserve">• 將 PID 納入未來閉環控制 baseline；在執行前固定 plant、動態 setpoint、disturbance、sampling、actuator limit 與安全 cutoff，並比較 tracking MAE、settling time、overshoot、control effort 與 constraint violations。PID 不屬於 3-D 場估測器；機箱假設模型控制模擬已評估，實體閉環控制仍為 NOT_EVALUATED。</w:t>
       </w:r>
     </w:p>
     <w:p>
@@ -27270,6 +27270,106 @@
         </w:tc>
       </w:tr>
     </w:tbl>
+    <w:p>
+      <w:pPr>
+        <w:pStyle w:val="Heading1"/>
+        <w:spacing w:before="0" w:after="0" w:line="360" w:lineRule="auto"/>
+      </w:pPr>
+      <w:r>
+        <w:rPr>
+          <w:b/>
+        </w:rPr>
+        <w:t xml:space="preserve">機箱受限制 MPC 探索性模擬</w:t>
+      </w:r>
+    </w:p>
+    <w:p>
+      <w:pPr>
+        <w:spacing w:before="0" w:after="0" w:line="360" w:lineRule="auto"/>
+      </w:pPr>
+      <w:r>
+        <w:t xml:space="preserve">2026-10-05 完成 CPU/GPU 雙熱節點與風扇延遲的受限制 MPC 探索性模擬。calibration 後鎖定控制器，另跑 36 回合、4,320 個控制步，涵蓋 validation、holdout、模型失配與過載。holdout 的三 seed macro tracking MAE 為固定風扇 5.4378°C、PID 2.6034°C、MPC 1.4426°C，MPC 相對 PID 降低 44.59%。nominal 六個 MPC 回合均無 PWM／slew 違例、超溫或求解回退。</w:t>
+      </w:r>
+    </w:p>
+    <w:p>
+      <w:pPr>
+        <w:spacing w:before="0" w:after="0" w:line="360" w:lineRule="auto"/>
+      </w:pPr>
+      <w:r>
+        <w:t xml:space="preserve">代價是 holdout 風扇能耗 proxy 由 PID 0.5873 Wh 增至 MPC 0.8234 Wh，PWM total variation 亦增加。過載仍超溫，MPC 平均每回合 63.33 步求解回退；溫度為軟限制，不能視為安全保證。參數、負載與功耗曲線均為假設，plant 與 predictor 雖採不同數值積分，仍共享名義熱參數。本結果只支持假設模型內的探索性可行性與追蹤改善，不代表機箱辨識、NTC、實體控制、throttling、整機功耗或跨設備確認。E8 保持 NOT_EVALUATED，LQR 保持 TODO。</w:t>
+      </w:r>
+    </w:p>
+    <w:p>
+      <w:pPr>
+        <w:pStyle w:val="Heading1"/>
+        <w:spacing w:before="0" w:after="0" w:line="360" w:lineRule="auto"/>
+      </w:pPr>
+      <w:r>
+        <w:rPr>
+          <w:b/>
+        </w:rPr>
+        <w:t xml:space="preserve">機箱四方法探索性模擬（v2）</w:t>
+      </w:r>
+    </w:p>
+    <w:p>
+      <w:pPr>
+        <w:spacing w:before="0" w:after="0" w:line="360" w:lineRule="auto"/>
+      </w:pPr>
+      <w:r>
+        <w:t xml:space="preserve">2026-10-05 第二階段完成四方法假設模型探索性比較，共 48 回合、5,760 控制步。每方法依相同三個 calibration seeds 評估三個候選，選參後凍結，再開啟新的 validation、holdout、假設模型變體與過載。holdout 三 seed 等權 tracking MAE：固定風扇 2.9051°C、PID＋平衡點前饋 1.7713°C、經限制的 LQR 1.7304°C、受限制 MPC 1.8071°C。相同方法順序的風扇能耗 proxy 為 0.7200／0.9832／1.0034／1.0567 Wh。研究判準：H-CTRL-01=SUPPORTED_SIMULATION_ONLY；H-CTRL-02=NOT_SUPPORTED；H-CTRL-03=NOT_SUPPORTED。</w:t>
+      </w:r>
+    </w:p>
+    <w:p>
+      <w:pPr>
+        <w:spacing w:before="0" w:after="0" w:line="360" w:lineRule="auto"/>
+      </w:pPr>
+      <w:r>
+        <w:t xml:space="preserve">固定風扇：取樣超溫 1096.7 s、數值回退 0.00 步／回合；PID＋平衡點前饋：取樣超溫 1040.0 s、數值回退 0.00 步／回合；經限制的 LQR：取樣超溫 1126.7 s、數值回退 0.00 步／回合；受限制 MPC：取樣超溫 1040.0 s、數值回退 0.00 步／回合</w:t>
+      </w:r>
+    </w:p>
+    <w:p>
+      <w:pPr>
+        <w:spacing w:before="0" w:after="0" w:line="360" w:lineRule="auto"/>
+      </w:pPr>
+      <w:r>
+        <w:t xml:space="preserve">四方法使用相同候選評估回合預算，CPU 計算時間並不相等。PID＋前饋、LQR 與 MPC 知道名義假設參數，且完整狀態可見；數值積分方式不同不等於獨立物理驗證。plant_holdout 是三組預先指定的假設參數變體，不能支持跨實體設備泛化。新合成 seeds 也不是實體設備樣本。超溫秒數按每 10 秒末端取樣估計；風扇能耗採 10u³ W 假設，不能代替整機功耗。溫度限制為軟限制，求解成功不代表熱能力足夠或硬體安全。實體機箱、NTC、throttling、整機功耗與 E8 仍為 NOT_EVALUATED。舊 v1 報告中的 LQR TODO 是第一階段的歷史狀態。</w:t>
+      </w:r>
+    </w:p>
+    <w:p>
+      <w:pPr>
+        <w:pStyle w:val="Heading1"/>
+        <w:spacing w:before="0" w:after="0" w:line="360" w:lineRule="auto"/>
+      </w:pPr>
+      <w:r>
+        <w:rPr>
+          <w:b/>
+        </w:rPr>
+        <w:t xml:space="preserve">稀疏機箱溫度候選原型（2026-10-06）</w:t>
+      </w:r>
+    </w:p>
+    <w:p>
+      <w:pPr>
+        <w:spacing w:before="0" w:after="0" w:line="360" w:lineRule="auto"/>
+      </w:pPr>
+      <w:r>
+        <w:t xml:space="preserve">2026-10-06 依教授交辦查證金屬傳熱與風管場景，建立熱源／金屬片／空氣熱網路候選原型，以金屬片、空氣與風扇觀測估測未提供的熱源溫度。三組假設平台採相同有限辨識程序，完成 108 回合、19,440 步。新的合成 holdout 上，名義物理／辨識物理／稀疏校正熱源估測 MAE 為 0.9610/0.6580/0.3352°C；稀疏校正相對辨識物理減少 49.06%，6/6 組改善。固定／PI／PID／單步排序／六步排序／六步無校正的 tracking MAE 為 1.5458/1.2219/1.2221/1.3969/1.2708/1.3644°C。六步相對單步減少 9.03%，仍未優於 PI；六步排序平均取樣超溫 103.33 秒／回合。H-ENC-31／H-ENC-32 只在此 exploratory simulation 的事前判準內 supported。</w:t>
+      </w:r>
+    </w:p>
+    <w:p>
+      <w:pPr>
+        <w:spacing w:before="0" w:after="0" w:line="360" w:lineRule="auto"/>
+      </w:pPr>
+      <w:r>
+        <w:t xml:space="preserve">本輪為溫度子問題與假設熱網路：已知熱容量和部分係數，單一方程家族、三組指定參數與合成噪聲。金屬片／風管增益是假設，未量測實際裝置；有限候選排序不是 LQR 或完整 MPC。20–30°C 外的樣本完整保留，但不擴張原室內模型適用域。濕度、光照、三維空間場、完整三因子遷移與實體辨識／介入均未評估。</w:t>
+      </w:r>
+    </w:p>
+    <w:p>
+      <w:pPr>
+        <w:spacing w:before="0" w:after="0" w:line="360" w:lineRule="auto"/>
+      </w:pPr>
+      <w:r>
+        <w:t xml:space="preserve">已為下週準備 LQR 與 Kalman (1960) Contributions to the Theory of Optimal Control 的介紹。重點查閱原文問題、狀態精確已知假設、可控／可觀測與 Riccati／穩定定理敘述；未重證全部證明，亦尚未口頭報告。</w:t>
+      </w:r>
+    </w:p>
     <w:p>
       <w:pPr>
         <w:pStyle w:val="Heading2"/>

</xml_diff>

<commit_message>
fix(research): correct sparse warnings, trace audit and observed QA provenance
</commit_message>
<xml_diff>
--- a/docs/papers/thesis/thesis_draft_zh.docx
+++ b/docs/papers/thesis/thesis_draft_zh.docx
@@ -27360,6 +27360,14 @@
       </w:pPr>
       <w:r>
         <w:t xml:space="preserve">本輪為溫度子問題與假設熱網路：已知熱容量和部分係數，單一方程家族、三組指定參數與合成噪聲。金屬片／風管增益是假設，未量測實際裝置；有限候選排序不是 LQR 或完整 MPC。20–30°C 外的樣本完整保留，但不擴張原室內模型適用域。濕度、光照、三維空間場、完整三因子遷移與實體辨識／介入均未評估。</w:t>
+      </w:r>
+    </w:p>
+    <w:p>
+      <w:pPr>
+        <w:spacing w:before="0" w:after="0" w:line="360" w:lineRule="auto"/>
+      </w:pPr>
+      <w:r>
+        <w:t xml:space="preserve">獨立審查後，我修正原始金屬片／空氣觀測可能被濾波掩蓋的警告判斷，並加上時間、真值連續性與獨立熱動態核對。原 108 回合通過加強核對；新版原始感測警告在既有 72 回合輸入回放中，命令與警告均無變化。這是已開啟資料的回歸檢查，未新增閉迴路或未見確認結果。另做事後散熱能力分析：接觸較差平台在入口 22°C、總熱量 3.35W 與全速風扇下，熱源平衡點為 32.40°C。該平台六步 holdout 的 360 步中，150 步的當下輸入若維持到穩態，全速平衡點仍高於 30°C；實際取樣超溫則為 124 步。兩者不能混用；穩態分析不是有限時域不可行證明，也未改原假設判準，應分開解釋散熱能力與控制誤差。</w:t>
       </w:r>
     </w:p>
     <w:p>

</xml_diff>

<commit_message>
research: integrate sparse enclosure session and verified professor briefing
</commit_message>
<xml_diff>
--- a/docs/papers/thesis/thesis_draft_zh.docx
+++ b/docs/papers/thesis/thesis_draft_zh.docx
@@ -27376,6 +27376,50 @@
       </w:pPr>
       <w:r>
         <w:t xml:space="preserve">已為下週準備 LQR 與 Kalman (1960) Contributions to the Theory of Optimal Control 的介紹。重點查閱原文問題、狀態精確已知假設、可控／可觀測與 Riccati／穩定定理敘述；未重證全部證明，亦尚未口頭報告。</w:t>
+      </w:r>
+    </w:p>
+    <w:p>
+      <w:pPr>
+        <w:pStyle w:val="Heading1"/>
+        <w:spacing w:before="0" w:after="0" w:line="360" w:lineRule="auto"/>
+      </w:pPr>
+      <w:r>
+        <w:rPr>
+          <w:b/>
+        </w:rPr>
+        <w:t xml:space="preserve">機箱溫度流程整合與跨模型探索 2026-10-12</w:t>
+      </w:r>
+    </w:p>
+    <w:p>
+      <w:pPr>
+        <w:spacing w:before="0" w:after="0" w:line="360" w:lineRule="auto"/>
+      </w:pPr>
+      <w:r>
+        <w:t xml:space="preserve">我把機箱溫度候選流程接入正式 Python 套件的獨立機箱介面，整合量測 CSV、有限參數辨識、稀疏估測、LQR／線性 MPC 與候選排序。新的四組假設平台共 88 回合、10,560 步，以相同 900 秒校正辨識接觸熱導、風扇對流增益、共同熱容量倍率與風扇延遲；固定容量比例和其他係數仍是假設。holdout 包含不同比例的熱容量與模型沒有的熱源直接傳到空氣路徑，所有方法只取得金屬片、空氣、風扇、入口與功率。名義／辨識／稀疏校正估測 MAE 為 1.0086/0.4681/0.3689°C。平均稀疏校正改善 21.19%，但只有 2/4 組改善，未達 3/4 判準，因此 H-ENC-51 不支持。</w:t>
+      </w:r>
+    </w:p>
+    <w:p>
+      <w:pPr>
+        <w:spacing w:before="0" w:after="0" w:line="360" w:lineRule="auto"/>
+      </w:pPr>
+      <w:r>
+        <w:t xml:space="preserve">固定／PI／PID／LQR／線性 MPC／單步／六步／六步無校正追蹤 MAE 為 1.7310/1.3471/1.3472/1.4872/1.3695/1.3764/1.3755/1.3943°C。六步相對單步改善 0.069%，未達 5%，H-ENC-52 不支持；PI 追蹤誤差低於六步排序，線性 MPC 的風扇能耗 proxy 較低但追蹤稍差。六步平均取樣超溫 3.75 秒／回合，全部閉迴路命令違例為零。這些是不同閉迴路軌跡下的比較；不能把命令合規當成真實安全。</w:t>
+      </w:r>
+    </w:p>
+    <w:p>
+      <w:pPr>
+        <w:spacing w:before="0" w:after="0" w:line="360" w:lineRule="auto"/>
+      </w:pPr>
+      <w:r>
+        <w:t xml:space="preserve">此次完成軟體流程、探索性模擬及實機實驗準備。相同有限校正是 commissioning-assisted synthetic transfer，並非零樣本或真實跨設備驗證；額外傳熱路徑只有一個指定反例，不證明任意方程家族泛化。LQR 經限幅後不再主張無限制最優性，MPC 使用當下線性化、六步預測與軟溫度代價。風扇 proxy 不是量測能耗。原室內濕度／照度和三維場維持原方法，未完成機箱三因子遷移；使用者於 2026-10-12 確認尚無設備或資料，實體辨識、NTC 精度與控制介入保留 NOT_EVALUATED；口頭報告尚無完成紀錄。</w:t>
+      </w:r>
+    </w:p>
+    <w:p>
+      <w:pPr>
+        <w:spacing w:before="0" w:after="0" w:line="360" w:lineRule="auto"/>
+      </w:pPr>
+      <w:r>
+        <w:t xml:space="preserve">全部 88 回合、10,560 筆已重算指標，核對時間、合成噪聲、原始感測警告、獨立熱動態與只讀觀測的流程回放；372 個歷史研究檔案未改動，一次性 E15 沒有重跑。時間偏移、同步真值偏移、風扇端點、原始觀測與指標五種破壞案例均被拒絕。</w:t>
       </w:r>
     </w:p>
     <w:p>

</xml_diff>

<commit_message>
research: audit bounded thermal structure selection and update HTML report
</commit_message>
<xml_diff>
--- a/docs/papers/thesis/thesis_draft_zh.docx
+++ b/docs/papers/thesis/thesis_draft_zh.docx
@@ -27420,6 +27420,50 @@
       </w:pPr>
       <w:r>
         <w:t xml:space="preserve">全部 88 回合、10,560 筆已重算指標，核對時間、合成噪聲、原始感測警告、獨立熱動態與只讀觀測的流程回放；372 個歷史研究檔案未改動，一次性 E15 沒有重跑。時間偏移、同步真值偏移、風扇端點、原始觀測與指標五種破壞案例均被拒絕。</w:t>
+      </w:r>
+    </w:p>
+    <w:p>
+      <w:pPr>
+        <w:pStyle w:val="Heading1"/>
+        <w:spacing w:before="0" w:after="0" w:line="360" w:lineRule="auto"/>
+      </w:pPr>
+      <w:r>
+        <w:rPr>
+          <w:b/>
+        </w:rPr>
+        <w:t xml:space="preserve">有限熱結構選擇與隱藏熱源反例 2026-10-12</w:t>
+      </w:r>
+    </w:p>
+    <w:p>
+      <w:pPr>
+        <w:spacing w:before="0" w:after="0" w:line="360" w:lineRule="auto"/>
+      </w:pPr>
+      <w:r>
+        <w:t xml:space="preserve">我接著測試四參數共同容量模型 S 與七參數模型 F，後者分別辨識三個熱容量，並增加熱源到空氣的熱導。每個平台僅用前 120 筆校正資料辨識，再用後 60 筆可見感測的加權誤差選擇；F 至少改善 5% 且求解成功才採用，選擇後不重新擬合。六個假設平台共 96 回合、11,520 筆新測試，校正合計 12 次擬合、993 次完整殘差呼叫、7.238 秒。三個平台選 F，另三個保留 S；沒有用熱源真值選模型。</w:t>
+      </w:r>
+    </w:p>
+    <w:p>
+      <w:pPr>
+        <w:spacing w:before="0" w:after="0" w:line="360" w:lineRule="auto"/>
+      </w:pPr>
+      <w:r>
+        <w:t xml:space="preserve">新 holdout 的 S／選擇模型在稀疏校正後，熱源估測 MAE 為 1.0764／1.3468°C，平均誤差增加 25.12%，僅 2/6 組改善，H-ENC-71 不支持。S／選擇模型的六步追蹤 MAE 為 1.4661／1.5093°C，增加 2.95%，H-ENC-72 不支持；兩者平均取樣超溫皆為 20.00 秒／回合。全部閉迴路命令違例為零，仍不能推論溫度安全。</w:t>
+      </w:r>
+    </w:p>
+    <w:p>
+      <w:pPr>
+        <w:spacing w:before="0" w:after="0" w:line="360" w:lineRule="auto"/>
+      </w:pPr>
+      <w:r>
+        <w:t xml:space="preserve">可見金屬片／空氣／風扇擬合較好，仍不足以保證隱藏熱源更準。對流失配平台的 F 熱源容量達下界、空氣容量達上界，提醒我模型係數可能互相補償；局部 Jacobian 條件數不是全域可辨識性證明。這次只隔離模型結構與 PI／六步排序，沒有重做全部控制器排名；前一階段 LQR／MPC 比較與負面結果仍保留。F 保留為探索候選，未因校正擬合較好就升格為較佳方法。這是有限校正後的合成溫度實驗，沒有設備量測、實體控制或完整三因子遷移證據。</w:t>
+      </w:r>
+    </w:p>
+    <w:p>
+      <w:pPr>
+        <w:spacing w:before="0" w:after="0" w:line="360" w:lineRule="auto"/>
+      </w:pPr>
+      <w:r>
+        <w:t xml:space="preserve">我已重算全部 96 回合、11,520 筆指標，核對另 1,080 筆校正來源，檢查時序切分、選擇規則、獨立熱動態與只讀觀測回放；六種破壞案例均被拒絕。514 個歷史證據檔案位元組未變，一次性 E15 與先前機箱實驗沒有重跑。</w:t>
       </w:r>
     </w:p>
     <w:p>

</xml_diff>

<commit_message>
docs: report audited LQR information diagnostics and bounded conclusions
</commit_message>
<xml_diff>
--- a/docs/papers/thesis/thesis_draft_zh.docx
+++ b/docs/papers/thesis/thesis_draft_zh.docx
@@ -27464,6 +27464,50 @@
       </w:pPr>
       <w:r>
         <w:t xml:space="preserve">我已重算全部 96 回合、11,520 筆指標，核對另 1,080 筆校正來源，檢查時序切分、選擇規則、獨立熱動態與只讀觀測回放；六種破壞案例均被拒絕。514 個歷史證據檔案位元組未變，一次性 E15 與先前機箱實驗沒有重跑。</w:t>
+      </w:r>
+    </w:p>
+    <w:p>
+      <w:pPr>
+        <w:pStyle w:val="Heading1"/>
+        <w:spacing w:before="0" w:after="0" w:line="360" w:lineRule="auto"/>
+      </w:pPr>
+      <w:r>
+        <w:rPr>
+          <w:b/>
+        </w:rPr>
+        <w:t xml:space="preserve">LQR 狀態與模型資訊診斷 2026-10-19</w:t>
+      </w:r>
+    </w:p>
+    <w:p>
+      <w:pPr>
+        <w:spacing w:before="0" w:after="0" w:line="360" w:lineRule="auto"/>
+      </w:pPr>
+      <w:r>
+        <w:t xml:space="preserve">我以四個新同族熱模型平台，各兩個新擾動種子，完成 40 回合、4,800 筆診斷。每個平台先用 180 筆可見觀測做相同的四參數辨識，共 720 筆校正資料。四個 LQR 組別分別替換控制器使用的狀態與參數，觀測器始終保留原辨識模型，另保留 PI 基準。真實狀態與正確參數只供模擬診斷，不能視為實機稀疏量測可用資訊。</w:t>
+      </w:r>
+    </w:p>
+    <w:p>
+      <w:pPr>
+        <w:spacing w:before="0" w:after="0" w:line="360" w:lineRule="auto"/>
+      </w:pPr>
+      <w:r>
+        <w:t xml:space="preserve">依序為估測／辨識、真值／辨識、估測／正確、真值／正確、PI，平均追蹤 MAE 為 1.4057／1.4208／1.3936／1.4110／1.4945°C。在真實狀態下換成正確控制器模型，誤差降低 0.69%，雖有 6/8 組改善，仍未達 5% 門檻。固定辨識模型而提供真實狀態，誤差反增 1.08%，僅 4/8 組改善。H-ENC-91 與 H-ENC-92 均不支持。</w:t>
+      </w:r>
+    </w:p>
+    <w:p>
+      <w:pPr>
+        <w:spacing w:before="0" w:after="0" w:line="360" w:lineRule="auto"/>
+      </w:pPr>
+      <w:r>
+        <w:t xml:space="preserve">估測／辨識 LQR 的原始命令有 80.52% 超出 PWM 範圍，20.10% 另受到變化率限制。這是警告覆寫前的命令診斷，比例可以重疊，不能直接解讀成限幅造成多少追蹤損失。50.21% 的當前擾動，其 28°C 目標落在真實模型兩端風扇穩態溫度範圍外；此為靜態提示，不能宣稱有限時間不可行。全部組別沒有取樣超溫或控制器回退。</w:t>
+      </w:r>
+    </w:p>
+    <w:p>
+      <w:pPr>
+        <w:spacing w:before="0" w:after="0" w:line="360" w:lineRule="auto"/>
+      </w:pPr>
+      <w:r>
+        <w:t xml:space="preserve">本批估測／辨識 LQR 相對 PI 的追蹤誤差降低 5.94%，風扇耗能 proxy 卻增加 70.44%。新舊排名不同，提醒我結論依賴平台、擾動及評分目標。這次移除了先前的隱藏功率偏差與額外熱路徑，只能支持新條件下的資訊介入結果；不能倒推 10/12 排名的唯一原因，也沒有證明估測誤差有益、固定權重最佳或實機有效。下一步應隔離權重與限制的作用，尚未執行。</w:t>
       </w:r>
     </w:p>
     <w:p>

</xml_diff>